<commit_message>
Update Deepskilling solutions for Design Patterns, DSA, Advanced SQL, and NUnit/Moq
</commit_message>
<xml_diff>
--- a/01-Design-Patterns-and-Principles/Exercise 1 - Implementing the Singleton Pattern.docx
+++ b/01-Design-Patterns-and-Principles/Exercise 1 - Implementing the Singleton Pattern.docx
@@ -21,12 +21,9 @@
           <w:sz w:val="36"/>
           <w:szCs w:val="36"/>
         </w:rPr>
-        <w:t>WEEK – 1 Assignments</w:t>
-      </w:r>
-    </w:p>
-    <w:p>
-      <w:pPr>
-        <w:jc w:val="center"/>
+        <w:t>Module</w:t>
+      </w:r>
+      <w:r>
         <w:rPr>
           <w:rFonts w:ascii="Times New Roman" w:hAnsi="Times New Roman" w:cs="Times New Roman"/>
           <w:b/>
@@ -34,8 +31,12 @@
           <w:sz w:val="36"/>
           <w:szCs w:val="36"/>
         </w:rPr>
-      </w:pPr>
-      <w:r>
+        <w:t xml:space="preserve"> – 1 Assignments</w:t>
+      </w:r>
+    </w:p>
+    <w:p>
+      <w:pPr>
+        <w:jc w:val="center"/>
         <w:rPr>
           <w:rFonts w:ascii="Times New Roman" w:hAnsi="Times New Roman" w:cs="Times New Roman"/>
           <w:b/>
@@ -43,6 +44,15 @@
           <w:sz w:val="36"/>
           <w:szCs w:val="36"/>
         </w:rPr>
+      </w:pPr>
+      <w:r>
+        <w:rPr>
+          <w:rFonts w:ascii="Times New Roman" w:hAnsi="Times New Roman" w:cs="Times New Roman"/>
+          <w:b/>
+          <w:bCs/>
+          <w:sz w:val="36"/>
+          <w:szCs w:val="36"/>
+        </w:rPr>
         <w:t>Design Principles &amp; Patterns</w:t>
       </w:r>
     </w:p>
@@ -76,9 +86,22 @@
           <w:sz w:val="28"/>
           <w:szCs w:val="28"/>
         </w:rPr>
-        <w:t>Mandatory Hands-</w:t>
-      </w:r>
-      <w:r>
+        <w:t>Mandatory Hands-on: -</w:t>
+      </w:r>
+    </w:p>
+    <w:p>
+      <w:pPr>
+        <w:rPr>
+          <w:rFonts w:ascii="Times New Roman" w:hAnsi="Times New Roman" w:cs="Times New Roman"/>
+          <w:b/>
+          <w:bCs/>
+          <w:sz w:val="2"/>
+          <w:szCs w:val="2"/>
+        </w:rPr>
+      </w:pPr>
+    </w:p>
+    <w:p>
+      <w:pPr>
         <w:rPr>
           <w:rFonts w:ascii="Times New Roman" w:hAnsi="Times New Roman" w:cs="Times New Roman"/>
           <w:b/>
@@ -86,22 +109,8 @@
           <w:sz w:val="28"/>
           <w:szCs w:val="28"/>
         </w:rPr>
-        <w:t>on: -</w:t>
-      </w:r>
-    </w:p>
-    <w:p>
-      <w:pPr>
-        <w:rPr>
-          <w:rFonts w:ascii="Times New Roman" w:hAnsi="Times New Roman" w:cs="Times New Roman"/>
-          <w:b/>
-          <w:bCs/>
-          <w:sz w:val="2"/>
-          <w:szCs w:val="2"/>
-        </w:rPr>
-      </w:pPr>
-    </w:p>
-    <w:p>
-      <w:pPr>
+      </w:pPr>
+      <w:r>
         <w:rPr>
           <w:rFonts w:ascii="Times New Roman" w:hAnsi="Times New Roman" w:cs="Times New Roman"/>
           <w:b/>
@@ -109,8 +118,11 @@
           <w:sz w:val="28"/>
           <w:szCs w:val="28"/>
         </w:rPr>
-      </w:pPr>
-      <w:r>
+        <w:t>Exercise 1: Implementing the Singleton Pattern</w:t>
+      </w:r>
+    </w:p>
+    <w:p>
+      <w:pPr>
         <w:rPr>
           <w:rFonts w:ascii="Times New Roman" w:hAnsi="Times New Roman" w:cs="Times New Roman"/>
           <w:b/>
@@ -118,11 +130,8 @@
           <w:sz w:val="28"/>
           <w:szCs w:val="28"/>
         </w:rPr>
-        <w:t>Exercise 1: Implementing the Singleton Pattern</w:t>
-      </w:r>
-    </w:p>
-    <w:p>
-      <w:pPr>
+      </w:pPr>
+      <w:r>
         <w:rPr>
           <w:rFonts w:ascii="Times New Roman" w:hAnsi="Times New Roman" w:cs="Times New Roman"/>
           <w:b/>
@@ -130,15 +139,6 @@
           <w:sz w:val="28"/>
           <w:szCs w:val="28"/>
         </w:rPr>
-      </w:pPr>
-      <w:r>
-        <w:rPr>
-          <w:rFonts w:ascii="Times New Roman" w:hAnsi="Times New Roman" w:cs="Times New Roman"/>
-          <w:b/>
-          <w:bCs/>
-          <w:sz w:val="28"/>
-          <w:szCs w:val="28"/>
-        </w:rPr>
         <w:t>Scenario:</w:t>
       </w:r>
     </w:p>
@@ -194,17 +194,7 @@
           <w:sz w:val="26"/>
           <w:szCs w:val="26"/>
         </w:rPr>
-        <w:t xml:space="preserve">Introduction to Singleton </w:t>
-      </w:r>
-      <w:r>
-        <w:rPr>
-          <w:rFonts w:ascii="Times New Roman" w:hAnsi="Times New Roman" w:cs="Times New Roman"/>
-          <w:b/>
-          <w:bCs/>
-          <w:sz w:val="26"/>
-          <w:szCs w:val="26"/>
-        </w:rPr>
-        <w:t>Pattern:</w:t>
+        <w:t>Introduction to Singleton Pattern:</w:t>
       </w:r>
     </w:p>
     <w:p>
@@ -238,17 +228,7 @@
           <w:sz w:val="26"/>
           <w:szCs w:val="26"/>
         </w:rPr>
-        <w:t xml:space="preserve">Need for Singleton </w:t>
-      </w:r>
-      <w:r>
-        <w:rPr>
-          <w:rFonts w:ascii="Times New Roman" w:hAnsi="Times New Roman" w:cs="Times New Roman"/>
-          <w:b/>
-          <w:bCs/>
-          <w:sz w:val="26"/>
-          <w:szCs w:val="26"/>
-        </w:rPr>
-        <w:t>Pattern:</w:t>
+        <w:t>Need for Singleton Pattern:</w:t>
       </w:r>
     </w:p>
     <w:p>
@@ -282,17 +262,7 @@
           <w:sz w:val="26"/>
           <w:szCs w:val="26"/>
         </w:rPr>
-        <w:t xml:space="preserve">Key </w:t>
-      </w:r>
-      <w:r>
-        <w:rPr>
-          <w:rFonts w:ascii="Times New Roman" w:hAnsi="Times New Roman" w:cs="Times New Roman"/>
-          <w:b/>
-          <w:bCs/>
-          <w:sz w:val="26"/>
-          <w:szCs w:val="26"/>
-        </w:rPr>
-        <w:t>Features:</w:t>
+        <w:t>Key Features:</w:t>
       </w:r>
     </w:p>
     <w:p>
@@ -379,17 +349,7 @@
           <w:szCs w:val="26"/>
         </w:rPr>
         <w:lastRenderedPageBreak/>
-        <w:t xml:space="preserve">Implementation </w:t>
-      </w:r>
-      <w:r>
-        <w:rPr>
-          <w:rFonts w:ascii="Times New Roman" w:hAnsi="Times New Roman" w:cs="Times New Roman"/>
-          <w:b/>
-          <w:bCs/>
-          <w:sz w:val="26"/>
-          <w:szCs w:val="26"/>
-        </w:rPr>
-        <w:t>Explanation:</w:t>
+        <w:t>Implementation Explanation:</w:t>
       </w:r>
     </w:p>
     <w:p>
@@ -419,7 +379,6 @@
         <w:t xml:space="preserve"> class is created. The constructor is declared private so that objects cannot be instantiated directly from outside the class. A private static variable is used to hold the single instance of the class. A public static method named </w:t>
       </w:r>
       <w:proofErr w:type="spellStart"/>
-      <w:proofErr w:type="gramStart"/>
       <w:r>
         <w:rPr>
           <w:rFonts w:ascii="Times New Roman" w:hAnsi="Times New Roman" w:cs="Times New Roman"/>
@@ -431,45 +390,28 @@
         <w:rPr>
           <w:rFonts w:ascii="Times New Roman" w:hAnsi="Times New Roman" w:cs="Times New Roman"/>
         </w:rPr>
-        <w:t>(</w:t>
-      </w:r>
-      <w:proofErr w:type="gramEnd"/>
-      <w:r>
-        <w:rPr>
-          <w:rFonts w:ascii="Times New Roman" w:hAnsi="Times New Roman" w:cs="Times New Roman"/>
-        </w:rPr>
-        <w:t>) is provided to create and return the instance whenever required. If the instance already exists, the same object is returned instead of creating a new one.</w:t>
-      </w:r>
-    </w:p>
-    <w:p>
-      <w:pPr>
-        <w:rPr>
-          <w:rFonts w:ascii="Times New Roman" w:hAnsi="Times New Roman" w:cs="Times New Roman"/>
-          <w:b/>
-          <w:bCs/>
-          <w:sz w:val="26"/>
-          <w:szCs w:val="26"/>
-        </w:rPr>
-      </w:pPr>
-      <w:r>
-        <w:rPr>
-          <w:rFonts w:ascii="Times New Roman" w:hAnsi="Times New Roman" w:cs="Times New Roman"/>
-          <w:b/>
-          <w:bCs/>
-          <w:sz w:val="26"/>
-          <w:szCs w:val="26"/>
-        </w:rPr>
-        <w:t xml:space="preserve">Complexity </w:t>
-      </w:r>
-      <w:r>
-        <w:rPr>
-          <w:rFonts w:ascii="Times New Roman" w:hAnsi="Times New Roman" w:cs="Times New Roman"/>
-          <w:b/>
-          <w:bCs/>
-          <w:sz w:val="26"/>
-          <w:szCs w:val="26"/>
-        </w:rPr>
-        <w:t>Analysis:</w:t>
+        <w:t>() is provided to create and return the instance whenever required. If the instance already exists, the same object is returned instead of creating a new one.</w:t>
+      </w:r>
+    </w:p>
+    <w:p>
+      <w:pPr>
+        <w:rPr>
+          <w:rFonts w:ascii="Times New Roman" w:hAnsi="Times New Roman" w:cs="Times New Roman"/>
+          <w:b/>
+          <w:bCs/>
+          <w:sz w:val="26"/>
+          <w:szCs w:val="26"/>
+        </w:rPr>
+      </w:pPr>
+      <w:r>
+        <w:rPr>
+          <w:rFonts w:ascii="Times New Roman" w:hAnsi="Times New Roman" w:cs="Times New Roman"/>
+          <w:b/>
+          <w:bCs/>
+          <w:sz w:val="26"/>
+          <w:szCs w:val="26"/>
+        </w:rPr>
+        <w:t>Complexity Analysis:</w:t>
       </w:r>
     </w:p>
     <w:p>
@@ -503,33 +445,13 @@
           <w:b/>
           <w:bCs/>
         </w:rPr>
-        <w:t xml:space="preserve">Time </w:t>
-      </w:r>
-      <w:r>
-        <w:rPr>
-          <w:rFonts w:ascii="Times New Roman" w:hAnsi="Times New Roman" w:cs="Times New Roman"/>
-          <w:b/>
-          <w:bCs/>
-        </w:rPr>
-        <w:t>Complexity:</w:t>
-      </w:r>
-      <w:r>
-        <w:rPr>
-          <w:rFonts w:ascii="Times New Roman" w:hAnsi="Times New Roman" w:cs="Times New Roman"/>
-        </w:rPr>
-        <w:t xml:space="preserve"> </w:t>
-      </w:r>
-      <w:r>
-        <w:rPr>
-          <w:rFonts w:ascii="Times New Roman" w:hAnsi="Times New Roman" w:cs="Times New Roman"/>
-        </w:rPr>
-        <w:t>O (</w:t>
-      </w:r>
-      <w:r>
-        <w:rPr>
-          <w:rFonts w:ascii="Times New Roman" w:hAnsi="Times New Roman" w:cs="Times New Roman"/>
-        </w:rPr>
-        <w:t>1)</w:t>
+        <w:t>Time Complexity:</w:t>
+      </w:r>
+      <w:r>
+        <w:rPr>
+          <w:rFonts w:ascii="Times New Roman" w:hAnsi="Times New Roman" w:cs="Times New Roman"/>
+        </w:rPr>
+        <w:t xml:space="preserve"> O (1)</w:t>
       </w:r>
     </w:p>
     <w:p>
@@ -550,64 +472,34 @@
           <w:b/>
           <w:bCs/>
         </w:rPr>
-        <w:t xml:space="preserve">Space </w:t>
-      </w:r>
-      <w:r>
-        <w:rPr>
-          <w:rFonts w:ascii="Times New Roman" w:hAnsi="Times New Roman" w:cs="Times New Roman"/>
-          <w:b/>
-          <w:bCs/>
-        </w:rPr>
-        <w:t>Complexity:</w:t>
-      </w:r>
-      <w:r>
-        <w:rPr>
-          <w:rFonts w:ascii="Times New Roman" w:hAnsi="Times New Roman" w:cs="Times New Roman"/>
-        </w:rPr>
-        <w:t xml:space="preserve"> </w:t>
-      </w:r>
-      <w:r>
-        <w:rPr>
-          <w:rFonts w:ascii="Times New Roman" w:hAnsi="Times New Roman" w:cs="Times New Roman"/>
-        </w:rPr>
-        <w:t>O (</w:t>
-      </w:r>
-      <w:r>
-        <w:rPr>
-          <w:rFonts w:ascii="Times New Roman" w:hAnsi="Times New Roman" w:cs="Times New Roman"/>
-        </w:rPr>
-        <w:t>1)</w:t>
-      </w:r>
-    </w:p>
-    <w:p>
-      <w:pPr>
-        <w:rPr>
-          <w:rFonts w:ascii="Times New Roman" w:hAnsi="Times New Roman" w:cs="Times New Roman"/>
-          <w:b/>
-          <w:bCs/>
-          <w:sz w:val="26"/>
-          <w:szCs w:val="26"/>
-        </w:rPr>
-      </w:pPr>
-      <w:r>
-        <w:rPr>
-          <w:rFonts w:ascii="Times New Roman" w:hAnsi="Times New Roman" w:cs="Times New Roman"/>
-          <w:b/>
-          <w:bCs/>
-          <w:sz w:val="26"/>
-          <w:szCs w:val="26"/>
-        </w:rPr>
-        <w:t xml:space="preserve">Real World </w:t>
-      </w:r>
-      <w:r>
-        <w:rPr>
-          <w:rFonts w:ascii="Times New Roman" w:hAnsi="Times New Roman" w:cs="Times New Roman"/>
-          <w:b/>
-          <w:bCs/>
-          <w:sz w:val="26"/>
-          <w:szCs w:val="26"/>
-        </w:rPr>
-        <w:t>Applications:</w:t>
+        <w:t>Space Complexity:</w:t>
+      </w:r>
+      <w:r>
+        <w:rPr>
+          <w:rFonts w:ascii="Times New Roman" w:hAnsi="Times New Roman" w:cs="Times New Roman"/>
+        </w:rPr>
+        <w:t xml:space="preserve"> O (1)</w:t>
+      </w:r>
+    </w:p>
+    <w:p>
+      <w:pPr>
+        <w:rPr>
+          <w:rFonts w:ascii="Times New Roman" w:hAnsi="Times New Roman" w:cs="Times New Roman"/>
+          <w:b/>
+          <w:bCs/>
+          <w:sz w:val="26"/>
+          <w:szCs w:val="26"/>
+        </w:rPr>
+      </w:pPr>
+      <w:r>
+        <w:rPr>
+          <w:rFonts w:ascii="Times New Roman" w:hAnsi="Times New Roman" w:cs="Times New Roman"/>
+          <w:b/>
+          <w:bCs/>
+          <w:sz w:val="26"/>
+          <w:szCs w:val="26"/>
+        </w:rPr>
+        <w:t>Real World Applications:</w:t>
       </w:r>
     </w:p>
     <w:p>
@@ -847,17 +739,7 @@
           <w:sz w:val="26"/>
           <w:szCs w:val="26"/>
         </w:rPr>
-        <w:t xml:space="preserve">File </w:t>
-      </w:r>
-      <w:r>
-        <w:rPr>
-          <w:rFonts w:ascii="Times New Roman" w:hAnsi="Times New Roman" w:cs="Times New Roman"/>
-          <w:b/>
-          <w:bCs/>
-          <w:sz w:val="26"/>
-          <w:szCs w:val="26"/>
-        </w:rPr>
-        <w:t>names:</w:t>
+        <w:t>File names:</w:t>
       </w:r>
     </w:p>
     <w:p>
@@ -902,6 +784,7 @@
       <w:r>
         <w:rPr>
           <w:rFonts w:ascii="Times New Roman" w:hAnsi="Times New Roman" w:cs="Times New Roman"/>
+          <w:noProof/>
         </w:rPr>
         <w:drawing>
           <wp:inline distT="0" distB="0" distL="0" distR="0" wp14:anchorId="64C51E6A" wp14:editId="589E70F7">
@@ -949,6 +832,7 @@
       <w:r>
         <w:rPr>
           <w:rFonts w:ascii="Times New Roman" w:hAnsi="Times New Roman" w:cs="Times New Roman"/>
+          <w:noProof/>
         </w:rPr>
         <w:drawing>
           <wp:inline distT="0" distB="0" distL="0" distR="0" wp14:anchorId="053ED0BB" wp14:editId="59FDF7F0">
@@ -1018,6 +902,7 @@
           <w:rFonts w:ascii="Times New Roman" w:hAnsi="Times New Roman" w:cs="Times New Roman"/>
           <w:b/>
           <w:bCs/>
+          <w:noProof/>
         </w:rPr>
         <w:drawing>
           <wp:inline distT="0" distB="0" distL="0" distR="0" wp14:anchorId="2BD8674C" wp14:editId="27FF8682">
@@ -1070,15 +955,7 @@
           <w:b/>
           <w:bCs/>
         </w:rPr>
-        <w:t xml:space="preserve">Advantages of Singleton </w:t>
-      </w:r>
-      <w:r>
-        <w:rPr>
-          <w:rFonts w:ascii="Times New Roman" w:hAnsi="Times New Roman" w:cs="Times New Roman"/>
-          <w:b/>
-          <w:bCs/>
-        </w:rPr>
-        <w:t>Pattern:</w:t>
+        <w:t>Advantages of Singleton Pattern:</w:t>
       </w:r>
     </w:p>
     <w:p>
@@ -1797,6 +1674,7 @@
   <w:style w:type="character" w:default="1" w:styleId="DefaultParagraphFont">
     <w:name w:val="Default Paragraph Font"/>
     <w:uiPriority w:val="1"/>
+    <w:semiHidden/>
     <w:unhideWhenUsed/>
   </w:style>
   <w:style w:type="table" w:default="1" w:styleId="TableNormal">

</xml_diff>